<commit_message>
Add multiple recipients and CC support for oficios, update Klever's department
</commit_message>
<xml_diff>
--- a/resources/HOJA_CARRERA_PINE.docx
+++ b/resources/HOJA_CARRERA_PINE.docx
@@ -1,8 +1,91 @@
 
 <file path=word/document.xml><?xml version="1.0" encoding="utf-8"?>
-<w:document xmlns:wpc="http://schemas.microsoft.com/office/word/2010/wordprocessingCanvas" xmlns:cx="http://schemas.microsoft.com/office/drawing/2014/chartex" xmlns:cx1="http://schemas.microsoft.com/office/drawing/2015/9/8/chartex" xmlns:cx2="http://schemas.microsoft.com/office/drawing/2015/10/21/chartex" xmlns:cx3="http://schemas.microsoft.com/office/drawing/2016/5/9/chartex" xmlns:cx4="http://schemas.microsoft.com/office/drawing/2016/5/10/chartex" xmlns:cx5="http://schemas.microsoft.com/office/drawing/2016/5/11/chartex" xmlns:cx6="http://schemas.microsoft.com/office/drawing/2016/5/12/chartex" xmlns:cx7="http://schemas.microsoft.com/office/drawing/2016/5/13/chartex" xmlns:cx8="http://schemas.microsoft.com/office/drawing/2016/5/14/chartex" xmlns:mc="http://schemas.openxmlformats.org/markup-compatibility/2006" xmlns:aink="http://schemas.microsoft.com/office/drawing/2016/ink" xmlns:am3d="http://schemas.microsoft.com/office/drawing/2017/model3d" xmlns:o="urn:schemas-microsoft-com:office:office" xmlns:r="http://schemas.openxmlformats.org/officeDocument/2006/relationships" xmlns:m="http://schemas.openxmlformats.org/officeDocument/2006/math" xmlns:v="urn:schemas-microsoft-com:vml" xmlns:wp14="http://schemas.microsoft.com/office/word/2010/wordprocessingDrawing" xmlns:wp="http://schemas.openxmlformats.org/drawingml/2006/wordprocessingDrawing" xmlns:w10="urn:schemas-microsoft-com:office:word" xmlns:w="http://schemas.openxmlformats.org/wordprocessingml/2006/main" xmlns:w14="http://schemas.microsoft.com/office/word/2010/wordml" xmlns:w15="http://schemas.microsoft.com/office/word/2012/wordml" xmlns:w16cex="http://schemas.microsoft.com/office/word/2018/wordml/cex" xmlns:w16cid="http://schemas.microsoft.com/office/word/2016/wordml/cid" xmlns:w16="http://schemas.microsoft.com/office/word/2018/wordml" xmlns:w16sdtdh="http://schemas.microsoft.com/office/word/2020/wordml/sdtdatahash" xmlns:w16se="http://schemas.microsoft.com/office/word/2015/wordml/symex" xmlns:wpg="http://schemas.microsoft.com/office/word/2010/wordprocessingGroup" xmlns:wpi="http://schemas.microsoft.com/office/word/2010/wordprocessingInk" xmlns:wne="http://schemas.microsoft.com/office/word/2006/wordml" xmlns:wps="http://schemas.microsoft.com/office/word/2010/wordprocessingShape" mc:Ignorable="w14 w15 w16se w16cid w16 w16cex w16sdtdh wp14">
+<w:document xmlns:wpc="http://schemas.microsoft.com/office/word/2010/wordprocessingCanvas" xmlns:cx="http://schemas.microsoft.com/office/drawing/2014/chartex" xmlns:cx1="http://schemas.microsoft.com/office/drawing/2015/9/8/chartex" xmlns:cx2="http://schemas.microsoft.com/office/drawing/2015/10/21/chartex" xmlns:cx3="http://schemas.microsoft.com/office/drawing/2016/5/9/chartex" xmlns:cx4="http://schemas.microsoft.com/office/drawing/2016/5/10/chartex" xmlns:cx5="http://schemas.microsoft.com/office/drawing/2016/5/11/chartex" xmlns:cx6="http://schemas.microsoft.com/office/drawing/2016/5/12/chartex" xmlns:cx7="http://schemas.microsoft.com/office/drawing/2016/5/13/chartex" xmlns:cx8="http://schemas.microsoft.com/office/drawing/2016/5/14/chartex" xmlns:mc="http://schemas.openxmlformats.org/markup-compatibility/2006" xmlns:aink="http://schemas.microsoft.com/office/drawing/2016/ink" xmlns:am3d="http://schemas.microsoft.com/office/drawing/2017/model3d" xmlns:o="urn:schemas-microsoft-com:office:office" xmlns:oel="http://schemas.microsoft.com/office/2019/extlst" xmlns:r="http://schemas.openxmlformats.org/officeDocument/2006/relationships" xmlns:m="http://schemas.openxmlformats.org/officeDocument/2006/math" xmlns:v="urn:schemas-microsoft-com:vml" xmlns:wp14="http://schemas.microsoft.com/office/word/2010/wordprocessingDrawing" xmlns:wp="http://schemas.openxmlformats.org/drawingml/2006/wordprocessingDrawing" xmlns:w10="urn:schemas-microsoft-com:office:word" xmlns:w="http://schemas.openxmlformats.org/wordprocessingml/2006/main" xmlns:w14="http://schemas.microsoft.com/office/word/2010/wordml" xmlns:w15="http://schemas.microsoft.com/office/word/2012/wordml" xmlns:w16cex="http://schemas.microsoft.com/office/word/2018/wordml/cex" xmlns:w16cid="http://schemas.microsoft.com/office/word/2016/wordml/cid" xmlns:w16="http://schemas.microsoft.com/office/word/2018/wordml" xmlns:w16du="http://schemas.microsoft.com/office/word/2023/wordml/word16du" xmlns:w16sdtdh="http://schemas.microsoft.com/office/word/2020/wordml/sdtdatahash" xmlns:w16se="http://schemas.microsoft.com/office/word/2015/wordml/symex" xmlns:wpg="http://schemas.microsoft.com/office/word/2010/wordprocessingGroup" xmlns:wpi="http://schemas.microsoft.com/office/word/2010/wordprocessingInk" xmlns:wne="http://schemas.microsoft.com/office/word/2006/wordml" xmlns:wps="http://schemas.microsoft.com/office/word/2010/wordprocessingShape" mc:Ignorable="w14 w15 w16se w16cid w16 w16cex w16sdtdh wp14">
   <w:body>
+    <w:p>
+      <w:r>
+        <w:t>{{NUM_OFICIO}}</w:t>
+      </w:r>
+      <w:r>
+        <w:br/>
+      </w:r>
+      <w:r>
+        <w:t>{{CIUDAD}}</w:t>
+      </w:r>
+      <w:r>
+        <w:t xml:space="preserve">, </w:t>
+      </w:r>
+      <w:r>
+        <w:t>{{FECHA_EMISION}}</w:t>
+      </w:r>
+    </w:p>
     <w:p/>
+    <w:p>
+      <w:r>
+        <w:t>{{DESTINATARIO_NOMBRE}}</w:t>
+      </w:r>
+      <w:r>
+        <w:br/>
+      </w:r>
+      <w:r>
+        <w:t>{{DESTINATARIO_CARGO}}</w:t>
+      </w:r>
+      <w:r>
+        <w:br/>
+      </w:r>
+      <w:r>
+        <w:t>{{DESTINATARIO_CARRERA}}</w:t>
+      </w:r>
+      <w:r>
+        <w:br/>
+        <w:t>Ciudad.-</w:t>
+      </w:r>
+      <w:r>
+        <w:br/>
+      </w:r>
+    </w:p>
+    <w:p>
+      <w:r>
+        <w:t>{{ASUNTO}}</w:t>
+      </w:r>
+    </w:p>
+    <w:p/>
+    <w:p>
+      <w:r>
+        <w:t xml:space="preserve">{{CUERPO}} </w:t>
+      </w:r>
+    </w:p>
+    <w:p/>
+    <w:p/>
+    <w:p>
+      <w:r>
+        <w:t>{{FIRMANTE_TITULO}}</w:t>
+      </w:r>
+      <w:r>
+        <w:br/>
+      </w:r>
+      <w:r>
+        <w:t>{{FIRMANTE_NOMBRE}}</w:t>
+      </w:r>
+      <w:r>
+        <w:br/>
+      </w:r>
+      <w:r>
+        <w:t>{{FIRMANTE_CARGO}}</w:t>
+      </w:r>
+      <w:r>
+        <w:br/>
+      </w:r>
+      <w:r>
+        <w:t>{{INICIALES}}</w:t>
+      </w:r>
+    </w:p>
+    <w:p/>
+    <w:p>
+      <w:r>
+        <w:t>{{COPIA_A}}</w:t>
+      </w:r>
+    </w:p>
     <w:sectPr>
       <w:headerReference w:type="even" r:id="rId6"/>
       <w:headerReference w:type="default" r:id="rId7"/>
@@ -17,7 +100,7 @@
 </file>
 
 <file path=word/endnotes.xml><?xml version="1.0" encoding="utf-8"?>
-<w:endnotes xmlns:wpc="http://schemas.microsoft.com/office/word/2010/wordprocessingCanvas" xmlns:cx="http://schemas.microsoft.com/office/drawing/2014/chartex" xmlns:cx1="http://schemas.microsoft.com/office/drawing/2015/9/8/chartex" xmlns:cx2="http://schemas.microsoft.com/office/drawing/2015/10/21/chartex" xmlns:cx3="http://schemas.microsoft.com/office/drawing/2016/5/9/chartex" xmlns:cx4="http://schemas.microsoft.com/office/drawing/2016/5/10/chartex" xmlns:cx5="http://schemas.microsoft.com/office/drawing/2016/5/11/chartex" xmlns:cx6="http://schemas.microsoft.com/office/drawing/2016/5/12/chartex" xmlns:cx7="http://schemas.microsoft.com/office/drawing/2016/5/13/chartex" xmlns:cx8="http://schemas.microsoft.com/office/drawing/2016/5/14/chartex" xmlns:mc="http://schemas.openxmlformats.org/markup-compatibility/2006" xmlns:aink="http://schemas.microsoft.com/office/drawing/2016/ink" xmlns:am3d="http://schemas.microsoft.com/office/drawing/2017/model3d" xmlns:o="urn:schemas-microsoft-com:office:office" xmlns:r="http://schemas.openxmlformats.org/officeDocument/2006/relationships" xmlns:m="http://schemas.openxmlformats.org/officeDocument/2006/math" xmlns:v="urn:schemas-microsoft-com:vml" xmlns:wp14="http://schemas.microsoft.com/office/word/2010/wordprocessingDrawing" xmlns:wp="http://schemas.openxmlformats.org/drawingml/2006/wordprocessingDrawing" xmlns:w10="urn:schemas-microsoft-com:office:word" xmlns:w="http://schemas.openxmlformats.org/wordprocessingml/2006/main" xmlns:w14="http://schemas.microsoft.com/office/word/2010/wordml" xmlns:w15="http://schemas.microsoft.com/office/word/2012/wordml" xmlns:w16cex="http://schemas.microsoft.com/office/word/2018/wordml/cex" xmlns:w16cid="http://schemas.microsoft.com/office/word/2016/wordml/cid" xmlns:w16="http://schemas.microsoft.com/office/word/2018/wordml" xmlns:w16sdtdh="http://schemas.microsoft.com/office/word/2020/wordml/sdtdatahash" xmlns:w16se="http://schemas.microsoft.com/office/word/2015/wordml/symex" xmlns:wpg="http://schemas.microsoft.com/office/word/2010/wordprocessingGroup" xmlns:wpi="http://schemas.microsoft.com/office/word/2010/wordprocessingInk" xmlns:wne="http://schemas.microsoft.com/office/word/2006/wordml" xmlns:wps="http://schemas.microsoft.com/office/word/2010/wordprocessingShape" mc:Ignorable="w14 w15 w16se w16cid w16 w16cex w16sdtdh wp14">
+<w:endnotes xmlns:wpc="http://schemas.microsoft.com/office/word/2010/wordprocessingCanvas" xmlns:cx="http://schemas.microsoft.com/office/drawing/2014/chartex" xmlns:cx1="http://schemas.microsoft.com/office/drawing/2015/9/8/chartex" xmlns:cx2="http://schemas.microsoft.com/office/drawing/2015/10/21/chartex" xmlns:cx3="http://schemas.microsoft.com/office/drawing/2016/5/9/chartex" xmlns:cx4="http://schemas.microsoft.com/office/drawing/2016/5/10/chartex" xmlns:cx5="http://schemas.microsoft.com/office/drawing/2016/5/11/chartex" xmlns:cx6="http://schemas.microsoft.com/office/drawing/2016/5/12/chartex" xmlns:cx7="http://schemas.microsoft.com/office/drawing/2016/5/13/chartex" xmlns:cx8="http://schemas.microsoft.com/office/drawing/2016/5/14/chartex" xmlns:mc="http://schemas.openxmlformats.org/markup-compatibility/2006" xmlns:aink="http://schemas.microsoft.com/office/drawing/2016/ink" xmlns:am3d="http://schemas.microsoft.com/office/drawing/2017/model3d" xmlns:o="urn:schemas-microsoft-com:office:office" xmlns:oel="http://schemas.microsoft.com/office/2019/extlst" xmlns:r="http://schemas.openxmlformats.org/officeDocument/2006/relationships" xmlns:m="http://schemas.openxmlformats.org/officeDocument/2006/math" xmlns:v="urn:schemas-microsoft-com:vml" xmlns:wp14="http://schemas.microsoft.com/office/word/2010/wordprocessingDrawing" xmlns:wp="http://schemas.openxmlformats.org/drawingml/2006/wordprocessingDrawing" xmlns:w10="urn:schemas-microsoft-com:office:word" xmlns:w="http://schemas.openxmlformats.org/wordprocessingml/2006/main" xmlns:w14="http://schemas.microsoft.com/office/word/2010/wordml" xmlns:w15="http://schemas.microsoft.com/office/word/2012/wordml" xmlns:w16cex="http://schemas.microsoft.com/office/word/2018/wordml/cex" xmlns:w16cid="http://schemas.microsoft.com/office/word/2016/wordml/cid" xmlns:w16="http://schemas.microsoft.com/office/word/2018/wordml" xmlns:w16du="http://schemas.microsoft.com/office/word/2023/wordml/word16du" xmlns:w16sdtdh="http://schemas.microsoft.com/office/word/2020/wordml/sdtdatahash" xmlns:w16se="http://schemas.microsoft.com/office/word/2015/wordml/symex" xmlns:wpg="http://schemas.microsoft.com/office/word/2010/wordprocessingGroup" xmlns:wpi="http://schemas.microsoft.com/office/word/2010/wordprocessingInk" xmlns:wne="http://schemas.microsoft.com/office/word/2006/wordml" xmlns:wps="http://schemas.microsoft.com/office/word/2010/wordprocessingShape" mc:Ignorable="w14 w15 w16se w16cid w16 w16cex w16sdtdh wp14">
   <w:endnote w:type="separator" w:id="-1">
     <w:p>
       <w:pPr>
@@ -42,7 +125,7 @@
 </file>
 
 <file path=word/footnotes.xml><?xml version="1.0" encoding="utf-8"?>
-<w:footnotes xmlns:wpc="http://schemas.microsoft.com/office/word/2010/wordprocessingCanvas" xmlns:cx="http://schemas.microsoft.com/office/drawing/2014/chartex" xmlns:cx1="http://schemas.microsoft.com/office/drawing/2015/9/8/chartex" xmlns:cx2="http://schemas.microsoft.com/office/drawing/2015/10/21/chartex" xmlns:cx3="http://schemas.microsoft.com/office/drawing/2016/5/9/chartex" xmlns:cx4="http://schemas.microsoft.com/office/drawing/2016/5/10/chartex" xmlns:cx5="http://schemas.microsoft.com/office/drawing/2016/5/11/chartex" xmlns:cx6="http://schemas.microsoft.com/office/drawing/2016/5/12/chartex" xmlns:cx7="http://schemas.microsoft.com/office/drawing/2016/5/13/chartex" xmlns:cx8="http://schemas.microsoft.com/office/drawing/2016/5/14/chartex" xmlns:mc="http://schemas.openxmlformats.org/markup-compatibility/2006" xmlns:aink="http://schemas.microsoft.com/office/drawing/2016/ink" xmlns:am3d="http://schemas.microsoft.com/office/drawing/2017/model3d" xmlns:o="urn:schemas-microsoft-com:office:office" xmlns:r="http://schemas.openxmlformats.org/officeDocument/2006/relationships" xmlns:m="http://schemas.openxmlformats.org/officeDocument/2006/math" xmlns:v="urn:schemas-microsoft-com:vml" xmlns:wp14="http://schemas.microsoft.com/office/word/2010/wordprocessingDrawing" xmlns:wp="http://schemas.openxmlformats.org/drawingml/2006/wordprocessingDrawing" xmlns:w10="urn:schemas-microsoft-com:office:word" xmlns:w="http://schemas.openxmlformats.org/wordprocessingml/2006/main" xmlns:w14="http://schemas.microsoft.com/office/word/2010/wordml" xmlns:w15="http://schemas.microsoft.com/office/word/2012/wordml" xmlns:w16cex="http://schemas.microsoft.com/office/word/2018/wordml/cex" xmlns:w16cid="http://schemas.microsoft.com/office/word/2016/wordml/cid" xmlns:w16="http://schemas.microsoft.com/office/word/2018/wordml" xmlns:w16sdtdh="http://schemas.microsoft.com/office/word/2020/wordml/sdtdatahash" xmlns:w16se="http://schemas.microsoft.com/office/word/2015/wordml/symex" xmlns:wpg="http://schemas.microsoft.com/office/word/2010/wordprocessingGroup" xmlns:wpi="http://schemas.microsoft.com/office/word/2010/wordprocessingInk" xmlns:wne="http://schemas.microsoft.com/office/word/2006/wordml" xmlns:wps="http://schemas.microsoft.com/office/word/2010/wordprocessingShape" mc:Ignorable="w14 w15 w16se w16cid w16 w16cex w16sdtdh wp14">
+<w:footnotes xmlns:wpc="http://schemas.microsoft.com/office/word/2010/wordprocessingCanvas" xmlns:cx="http://schemas.microsoft.com/office/drawing/2014/chartex" xmlns:cx1="http://schemas.microsoft.com/office/drawing/2015/9/8/chartex" xmlns:cx2="http://schemas.microsoft.com/office/drawing/2015/10/21/chartex" xmlns:cx3="http://schemas.microsoft.com/office/drawing/2016/5/9/chartex" xmlns:cx4="http://schemas.microsoft.com/office/drawing/2016/5/10/chartex" xmlns:cx5="http://schemas.microsoft.com/office/drawing/2016/5/11/chartex" xmlns:cx6="http://schemas.microsoft.com/office/drawing/2016/5/12/chartex" xmlns:cx7="http://schemas.microsoft.com/office/drawing/2016/5/13/chartex" xmlns:cx8="http://schemas.microsoft.com/office/drawing/2016/5/14/chartex" xmlns:mc="http://schemas.openxmlformats.org/markup-compatibility/2006" xmlns:aink="http://schemas.microsoft.com/office/drawing/2016/ink" xmlns:am3d="http://schemas.microsoft.com/office/drawing/2017/model3d" xmlns:o="urn:schemas-microsoft-com:office:office" xmlns:oel="http://schemas.microsoft.com/office/2019/extlst" xmlns:r="http://schemas.openxmlformats.org/officeDocument/2006/relationships" xmlns:m="http://schemas.openxmlformats.org/officeDocument/2006/math" xmlns:v="urn:schemas-microsoft-com:vml" xmlns:wp14="http://schemas.microsoft.com/office/word/2010/wordprocessingDrawing" xmlns:wp="http://schemas.openxmlformats.org/drawingml/2006/wordprocessingDrawing" xmlns:w10="urn:schemas-microsoft-com:office:word" xmlns:w="http://schemas.openxmlformats.org/wordprocessingml/2006/main" xmlns:w14="http://schemas.microsoft.com/office/word/2010/wordml" xmlns:w15="http://schemas.microsoft.com/office/word/2012/wordml" xmlns:w16cex="http://schemas.microsoft.com/office/word/2018/wordml/cex" xmlns:w16cid="http://schemas.microsoft.com/office/word/2016/wordml/cid" xmlns:w16="http://schemas.microsoft.com/office/word/2018/wordml" xmlns:w16du="http://schemas.microsoft.com/office/word/2023/wordml/word16du" xmlns:w16sdtdh="http://schemas.microsoft.com/office/word/2020/wordml/sdtdatahash" xmlns:w16se="http://schemas.microsoft.com/office/word/2015/wordml/symex" xmlns:wpg="http://schemas.microsoft.com/office/word/2010/wordprocessingGroup" xmlns:wpi="http://schemas.microsoft.com/office/word/2010/wordprocessingInk" xmlns:wne="http://schemas.microsoft.com/office/word/2006/wordml" xmlns:wps="http://schemas.microsoft.com/office/word/2010/wordprocessingShape" mc:Ignorable="w14 w15 w16se w16cid w16 w16cex w16sdtdh wp14">
   <w:footnote w:type="separator" w:id="-1">
     <w:p>
       <w:pPr>
@@ -67,7 +150,7 @@
 </file>
 
 <file path=word/header1.xml><?xml version="1.0" encoding="utf-8"?>
-<w:hdr xmlns:wpc="http://schemas.microsoft.com/office/word/2010/wordprocessingCanvas" xmlns:cx="http://schemas.microsoft.com/office/drawing/2014/chartex" xmlns:cx1="http://schemas.microsoft.com/office/drawing/2015/9/8/chartex" xmlns:cx2="http://schemas.microsoft.com/office/drawing/2015/10/21/chartex" xmlns:cx3="http://schemas.microsoft.com/office/drawing/2016/5/9/chartex" xmlns:cx4="http://schemas.microsoft.com/office/drawing/2016/5/10/chartex" xmlns:cx5="http://schemas.microsoft.com/office/drawing/2016/5/11/chartex" xmlns:cx6="http://schemas.microsoft.com/office/drawing/2016/5/12/chartex" xmlns:cx7="http://schemas.microsoft.com/office/drawing/2016/5/13/chartex" xmlns:cx8="http://schemas.microsoft.com/office/drawing/2016/5/14/chartex" xmlns:mc="http://schemas.openxmlformats.org/markup-compatibility/2006" xmlns:aink="http://schemas.microsoft.com/office/drawing/2016/ink" xmlns:am3d="http://schemas.microsoft.com/office/drawing/2017/model3d" xmlns:o="urn:schemas-microsoft-com:office:office" xmlns:r="http://schemas.openxmlformats.org/officeDocument/2006/relationships" xmlns:m="http://schemas.openxmlformats.org/officeDocument/2006/math" xmlns:v="urn:schemas-microsoft-com:vml" xmlns:wp14="http://schemas.microsoft.com/office/word/2010/wordprocessingDrawing" xmlns:wp="http://schemas.openxmlformats.org/drawingml/2006/wordprocessingDrawing" xmlns:w10="urn:schemas-microsoft-com:office:word" xmlns:w="http://schemas.openxmlformats.org/wordprocessingml/2006/main" xmlns:w14="http://schemas.microsoft.com/office/word/2010/wordml" xmlns:w15="http://schemas.microsoft.com/office/word/2012/wordml" xmlns:w16cex="http://schemas.microsoft.com/office/word/2018/wordml/cex" xmlns:w16cid="http://schemas.microsoft.com/office/word/2016/wordml/cid" xmlns:w16="http://schemas.microsoft.com/office/word/2018/wordml" xmlns:w16sdtdh="http://schemas.microsoft.com/office/word/2020/wordml/sdtdatahash" xmlns:w16se="http://schemas.microsoft.com/office/word/2015/wordml/symex" xmlns:wpg="http://schemas.microsoft.com/office/word/2010/wordprocessingGroup" xmlns:wpi="http://schemas.microsoft.com/office/word/2010/wordprocessingInk" xmlns:wne="http://schemas.microsoft.com/office/word/2006/wordml" xmlns:wps="http://schemas.microsoft.com/office/word/2010/wordprocessingShape" mc:Ignorable="w14 w15 w16se w16cid w16 w16cex w16sdtdh wp14">
+<w:hdr xmlns:wpc="http://schemas.microsoft.com/office/word/2010/wordprocessingCanvas" xmlns:cx="http://schemas.microsoft.com/office/drawing/2014/chartex" xmlns:cx1="http://schemas.microsoft.com/office/drawing/2015/9/8/chartex" xmlns:cx2="http://schemas.microsoft.com/office/drawing/2015/10/21/chartex" xmlns:cx3="http://schemas.microsoft.com/office/drawing/2016/5/9/chartex" xmlns:cx4="http://schemas.microsoft.com/office/drawing/2016/5/10/chartex" xmlns:cx5="http://schemas.microsoft.com/office/drawing/2016/5/11/chartex" xmlns:cx6="http://schemas.microsoft.com/office/drawing/2016/5/12/chartex" xmlns:cx7="http://schemas.microsoft.com/office/drawing/2016/5/13/chartex" xmlns:cx8="http://schemas.microsoft.com/office/drawing/2016/5/14/chartex" xmlns:mc="http://schemas.openxmlformats.org/markup-compatibility/2006" xmlns:aink="http://schemas.microsoft.com/office/drawing/2016/ink" xmlns:am3d="http://schemas.microsoft.com/office/drawing/2017/model3d" xmlns:o="urn:schemas-microsoft-com:office:office" xmlns:oel="http://schemas.microsoft.com/office/2019/extlst" xmlns:r="http://schemas.openxmlformats.org/officeDocument/2006/relationships" xmlns:m="http://schemas.openxmlformats.org/officeDocument/2006/math" xmlns:v="urn:schemas-microsoft-com:vml" xmlns:wp14="http://schemas.microsoft.com/office/word/2010/wordprocessingDrawing" xmlns:wp="http://schemas.openxmlformats.org/drawingml/2006/wordprocessingDrawing" xmlns:w10="urn:schemas-microsoft-com:office:word" xmlns:w="http://schemas.openxmlformats.org/wordprocessingml/2006/main" xmlns:w14="http://schemas.microsoft.com/office/word/2010/wordml" xmlns:w15="http://schemas.microsoft.com/office/word/2012/wordml" xmlns:w16cex="http://schemas.microsoft.com/office/word/2018/wordml/cex" xmlns:w16cid="http://schemas.microsoft.com/office/word/2016/wordml/cid" xmlns:w16="http://schemas.microsoft.com/office/word/2018/wordml" xmlns:w16du="http://schemas.microsoft.com/office/word/2023/wordml/word16du" xmlns:w16sdtdh="http://schemas.microsoft.com/office/word/2020/wordml/sdtdatahash" xmlns:w16se="http://schemas.microsoft.com/office/word/2015/wordml/symex" xmlns:wpg="http://schemas.microsoft.com/office/word/2010/wordprocessingGroup" xmlns:wpi="http://schemas.microsoft.com/office/word/2010/wordprocessingInk" xmlns:wne="http://schemas.microsoft.com/office/word/2006/wordml" xmlns:wps="http://schemas.microsoft.com/office/word/2010/wordprocessingShape" mc:Ignorable="w14 w15 w16se w16cid w16 w16cex w16sdtdh wp14">
   <w:p>
     <w:pPr>
       <w:pStyle w:val="Encabezado"/>
@@ -96,8 +179,9 @@
           <v:path o:extrusionok="f" gradientshapeok="t" o:connecttype="rect"/>
           <o:lock v:ext="edit" aspectratio="t"/>
         </v:shapetype>
-        <v:shape id="WordPictureWatermark766810063" o:spid="_x0000_s2086" type="#_x0000_t75" style="position:absolute;margin-left:0;margin-top:0;width:595.7pt;height:841.9pt;z-index:-251657216;mso-position-horizontal:center;mso-position-horizontal-relative:margin;mso-position-vertical:center;mso-position-vertical-relative:margin" o:allowincell="f">
+        <v:shape id="WordPictureWatermark766810063" o:spid="_x0000_s1062" type="#_x0000_t75" style="position:absolute;margin-left:0;margin-top:0;width:595.7pt;height:841.9pt;z-index:-251657216;mso-position-horizontal:center;mso-position-horizontal-relative:margin;mso-position-vertical:center;mso-position-vertical-relative:margin" o:allowincell="f">
           <v:imagedata r:id="rId1" o:title="9 IDIOMAS"/>
+          <w10:wrap anchorx="margin" anchory="margin"/>
         </v:shape>
       </w:pict>
     </w:r>
@@ -106,7 +190,7 @@
 </file>
 
 <file path=word/header2.xml><?xml version="1.0" encoding="utf-8"?>
-<w:hdr xmlns:wpc="http://schemas.microsoft.com/office/word/2010/wordprocessingCanvas" xmlns:cx="http://schemas.microsoft.com/office/drawing/2014/chartex" xmlns:cx1="http://schemas.microsoft.com/office/drawing/2015/9/8/chartex" xmlns:cx2="http://schemas.microsoft.com/office/drawing/2015/10/21/chartex" xmlns:cx3="http://schemas.microsoft.com/office/drawing/2016/5/9/chartex" xmlns:cx4="http://schemas.microsoft.com/office/drawing/2016/5/10/chartex" xmlns:cx5="http://schemas.microsoft.com/office/drawing/2016/5/11/chartex" xmlns:cx6="http://schemas.microsoft.com/office/drawing/2016/5/12/chartex" xmlns:cx7="http://schemas.microsoft.com/office/drawing/2016/5/13/chartex" xmlns:cx8="http://schemas.microsoft.com/office/drawing/2016/5/14/chartex" xmlns:mc="http://schemas.openxmlformats.org/markup-compatibility/2006" xmlns:aink="http://schemas.microsoft.com/office/drawing/2016/ink" xmlns:am3d="http://schemas.microsoft.com/office/drawing/2017/model3d" xmlns:o="urn:schemas-microsoft-com:office:office" xmlns:r="http://schemas.openxmlformats.org/officeDocument/2006/relationships" xmlns:m="http://schemas.openxmlformats.org/officeDocument/2006/math" xmlns:v="urn:schemas-microsoft-com:vml" xmlns:wp14="http://schemas.microsoft.com/office/word/2010/wordprocessingDrawing" xmlns:wp="http://schemas.openxmlformats.org/drawingml/2006/wordprocessingDrawing" xmlns:w10="urn:schemas-microsoft-com:office:word" xmlns:w="http://schemas.openxmlformats.org/wordprocessingml/2006/main" xmlns:w14="http://schemas.microsoft.com/office/word/2010/wordml" xmlns:w15="http://schemas.microsoft.com/office/word/2012/wordml" xmlns:w16cex="http://schemas.microsoft.com/office/word/2018/wordml/cex" xmlns:w16cid="http://schemas.microsoft.com/office/word/2016/wordml/cid" xmlns:w16="http://schemas.microsoft.com/office/word/2018/wordml" xmlns:w16sdtdh="http://schemas.microsoft.com/office/word/2020/wordml/sdtdatahash" xmlns:w16se="http://schemas.microsoft.com/office/word/2015/wordml/symex" xmlns:wpg="http://schemas.microsoft.com/office/word/2010/wordprocessingGroup" xmlns:wpi="http://schemas.microsoft.com/office/word/2010/wordprocessingInk" xmlns:wne="http://schemas.microsoft.com/office/word/2006/wordml" xmlns:wps="http://schemas.microsoft.com/office/word/2010/wordprocessingShape" mc:Ignorable="w14 w15 w16se w16cid w16 w16cex w16sdtdh wp14">
+<w:hdr xmlns:wpc="http://schemas.microsoft.com/office/word/2010/wordprocessingCanvas" xmlns:cx="http://schemas.microsoft.com/office/drawing/2014/chartex" xmlns:cx1="http://schemas.microsoft.com/office/drawing/2015/9/8/chartex" xmlns:cx2="http://schemas.microsoft.com/office/drawing/2015/10/21/chartex" xmlns:cx3="http://schemas.microsoft.com/office/drawing/2016/5/9/chartex" xmlns:cx4="http://schemas.microsoft.com/office/drawing/2016/5/10/chartex" xmlns:cx5="http://schemas.microsoft.com/office/drawing/2016/5/11/chartex" xmlns:cx6="http://schemas.microsoft.com/office/drawing/2016/5/12/chartex" xmlns:cx7="http://schemas.microsoft.com/office/drawing/2016/5/13/chartex" xmlns:cx8="http://schemas.microsoft.com/office/drawing/2016/5/14/chartex" xmlns:mc="http://schemas.openxmlformats.org/markup-compatibility/2006" xmlns:aink="http://schemas.microsoft.com/office/drawing/2016/ink" xmlns:am3d="http://schemas.microsoft.com/office/drawing/2017/model3d" xmlns:o="urn:schemas-microsoft-com:office:office" xmlns:oel="http://schemas.microsoft.com/office/2019/extlst" xmlns:r="http://schemas.openxmlformats.org/officeDocument/2006/relationships" xmlns:m="http://schemas.openxmlformats.org/officeDocument/2006/math" xmlns:v="urn:schemas-microsoft-com:vml" xmlns:wp14="http://schemas.microsoft.com/office/word/2010/wordprocessingDrawing" xmlns:wp="http://schemas.openxmlformats.org/drawingml/2006/wordprocessingDrawing" xmlns:w10="urn:schemas-microsoft-com:office:word" xmlns:w="http://schemas.openxmlformats.org/wordprocessingml/2006/main" xmlns:w14="http://schemas.microsoft.com/office/word/2010/wordml" xmlns:w15="http://schemas.microsoft.com/office/word/2012/wordml" xmlns:w16cex="http://schemas.microsoft.com/office/word/2018/wordml/cex" xmlns:w16cid="http://schemas.microsoft.com/office/word/2016/wordml/cid" xmlns:w16="http://schemas.microsoft.com/office/word/2018/wordml" xmlns:w16du="http://schemas.microsoft.com/office/word/2023/wordml/word16du" xmlns:w16sdtdh="http://schemas.microsoft.com/office/word/2020/wordml/sdtdatahash" xmlns:w16se="http://schemas.microsoft.com/office/word/2015/wordml/symex" xmlns:wpg="http://schemas.microsoft.com/office/word/2010/wordprocessingGroup" xmlns:wpi="http://schemas.microsoft.com/office/word/2010/wordprocessingInk" xmlns:wne="http://schemas.microsoft.com/office/word/2006/wordml" xmlns:wps="http://schemas.microsoft.com/office/word/2010/wordprocessingShape" mc:Ignorable="w14 w15 w16se w16cid w16 w16cex w16sdtdh wp14">
   <w:p>
     <w:pPr>
       <w:pStyle w:val="Encabezado"/>
@@ -135,8 +219,9 @@
           <v:path o:extrusionok="f" gradientshapeok="t" o:connecttype="rect"/>
           <o:lock v:ext="edit" aspectratio="t"/>
         </v:shapetype>
-        <v:shape id="WordPictureWatermark766810064" o:spid="_x0000_s2087" type="#_x0000_t75" style="position:absolute;margin-left:-85.25pt;margin-top:-103.15pt;width:595.7pt;height:841.9pt;z-index:-251656192;mso-position-horizontal-relative:margin;mso-position-vertical-relative:margin" o:allowincell="f">
+        <v:shape id="WordPictureWatermark766810064" o:spid="_x0000_s1063" type="#_x0000_t75" style="position:absolute;margin-left:-85.25pt;margin-top:-103.15pt;width:595.7pt;height:841.9pt;z-index:-251656192;mso-position-horizontal-relative:margin;mso-position-vertical-relative:margin" o:allowincell="f">
           <v:imagedata r:id="rId1" o:title="9 IDIOMAS"/>
+          <w10:wrap anchorx="margin" anchory="margin"/>
         </v:shape>
       </w:pict>
     </w:r>
@@ -165,7 +250,7 @@
 </file>
 
 <file path=word/header3.xml><?xml version="1.0" encoding="utf-8"?>
-<w:hdr xmlns:wpc="http://schemas.microsoft.com/office/word/2010/wordprocessingCanvas" xmlns:cx="http://schemas.microsoft.com/office/drawing/2014/chartex" xmlns:cx1="http://schemas.microsoft.com/office/drawing/2015/9/8/chartex" xmlns:cx2="http://schemas.microsoft.com/office/drawing/2015/10/21/chartex" xmlns:cx3="http://schemas.microsoft.com/office/drawing/2016/5/9/chartex" xmlns:cx4="http://schemas.microsoft.com/office/drawing/2016/5/10/chartex" xmlns:cx5="http://schemas.microsoft.com/office/drawing/2016/5/11/chartex" xmlns:cx6="http://schemas.microsoft.com/office/drawing/2016/5/12/chartex" xmlns:cx7="http://schemas.microsoft.com/office/drawing/2016/5/13/chartex" xmlns:cx8="http://schemas.microsoft.com/office/drawing/2016/5/14/chartex" xmlns:mc="http://schemas.openxmlformats.org/markup-compatibility/2006" xmlns:aink="http://schemas.microsoft.com/office/drawing/2016/ink" xmlns:am3d="http://schemas.microsoft.com/office/drawing/2017/model3d" xmlns:o="urn:schemas-microsoft-com:office:office" xmlns:r="http://schemas.openxmlformats.org/officeDocument/2006/relationships" xmlns:m="http://schemas.openxmlformats.org/officeDocument/2006/math" xmlns:v="urn:schemas-microsoft-com:vml" xmlns:wp14="http://schemas.microsoft.com/office/word/2010/wordprocessingDrawing" xmlns:wp="http://schemas.openxmlformats.org/drawingml/2006/wordprocessingDrawing" xmlns:w10="urn:schemas-microsoft-com:office:word" xmlns:w="http://schemas.openxmlformats.org/wordprocessingml/2006/main" xmlns:w14="http://schemas.microsoft.com/office/word/2010/wordml" xmlns:w15="http://schemas.microsoft.com/office/word/2012/wordml" xmlns:w16cex="http://schemas.microsoft.com/office/word/2018/wordml/cex" xmlns:w16cid="http://schemas.microsoft.com/office/word/2016/wordml/cid" xmlns:w16="http://schemas.microsoft.com/office/word/2018/wordml" xmlns:w16sdtdh="http://schemas.microsoft.com/office/word/2020/wordml/sdtdatahash" xmlns:w16se="http://schemas.microsoft.com/office/word/2015/wordml/symex" xmlns:wpg="http://schemas.microsoft.com/office/word/2010/wordprocessingGroup" xmlns:wpi="http://schemas.microsoft.com/office/word/2010/wordprocessingInk" xmlns:wne="http://schemas.microsoft.com/office/word/2006/wordml" xmlns:wps="http://schemas.microsoft.com/office/word/2010/wordprocessingShape" mc:Ignorable="w14 w15 w16se w16cid w16 w16cex w16sdtdh wp14">
+<w:hdr xmlns:wpc="http://schemas.microsoft.com/office/word/2010/wordprocessingCanvas" xmlns:cx="http://schemas.microsoft.com/office/drawing/2014/chartex" xmlns:cx1="http://schemas.microsoft.com/office/drawing/2015/9/8/chartex" xmlns:cx2="http://schemas.microsoft.com/office/drawing/2015/10/21/chartex" xmlns:cx3="http://schemas.microsoft.com/office/drawing/2016/5/9/chartex" xmlns:cx4="http://schemas.microsoft.com/office/drawing/2016/5/10/chartex" xmlns:cx5="http://schemas.microsoft.com/office/drawing/2016/5/11/chartex" xmlns:cx6="http://schemas.microsoft.com/office/drawing/2016/5/12/chartex" xmlns:cx7="http://schemas.microsoft.com/office/drawing/2016/5/13/chartex" xmlns:cx8="http://schemas.microsoft.com/office/drawing/2016/5/14/chartex" xmlns:mc="http://schemas.openxmlformats.org/markup-compatibility/2006" xmlns:aink="http://schemas.microsoft.com/office/drawing/2016/ink" xmlns:am3d="http://schemas.microsoft.com/office/drawing/2017/model3d" xmlns:o="urn:schemas-microsoft-com:office:office" xmlns:oel="http://schemas.microsoft.com/office/2019/extlst" xmlns:r="http://schemas.openxmlformats.org/officeDocument/2006/relationships" xmlns:m="http://schemas.openxmlformats.org/officeDocument/2006/math" xmlns:v="urn:schemas-microsoft-com:vml" xmlns:wp14="http://schemas.microsoft.com/office/word/2010/wordprocessingDrawing" xmlns:wp="http://schemas.openxmlformats.org/drawingml/2006/wordprocessingDrawing" xmlns:w10="urn:schemas-microsoft-com:office:word" xmlns:w="http://schemas.openxmlformats.org/wordprocessingml/2006/main" xmlns:w14="http://schemas.microsoft.com/office/word/2010/wordml" xmlns:w15="http://schemas.microsoft.com/office/word/2012/wordml" xmlns:w16cex="http://schemas.microsoft.com/office/word/2018/wordml/cex" xmlns:w16cid="http://schemas.microsoft.com/office/word/2016/wordml/cid" xmlns:w16="http://schemas.microsoft.com/office/word/2018/wordml" xmlns:w16du="http://schemas.microsoft.com/office/word/2023/wordml/word16du" xmlns:w16sdtdh="http://schemas.microsoft.com/office/word/2020/wordml/sdtdatahash" xmlns:w16se="http://schemas.microsoft.com/office/word/2015/wordml/symex" xmlns:wpg="http://schemas.microsoft.com/office/word/2010/wordprocessingGroup" xmlns:wpi="http://schemas.microsoft.com/office/word/2010/wordprocessingInk" xmlns:wne="http://schemas.microsoft.com/office/word/2006/wordml" xmlns:wps="http://schemas.microsoft.com/office/word/2010/wordprocessingShape" mc:Ignorable="w14 w15 w16se w16cid w16 w16cex w16sdtdh wp14">
   <w:p>
     <w:pPr>
       <w:pStyle w:val="Encabezado"/>
@@ -194,8 +279,9 @@
           <v:path o:extrusionok="f" gradientshapeok="t" o:connecttype="rect"/>
           <o:lock v:ext="edit" aspectratio="t"/>
         </v:shapetype>
-        <v:shape id="WordPictureWatermark766810062" o:spid="_x0000_s2085" type="#_x0000_t75" style="position:absolute;margin-left:0;margin-top:0;width:595.7pt;height:841.9pt;z-index:-251658240;mso-position-horizontal:center;mso-position-horizontal-relative:margin;mso-position-vertical:center;mso-position-vertical-relative:margin" o:allowincell="f">
+        <v:shape id="WordPictureWatermark766810062" o:spid="_x0000_s1061" type="#_x0000_t75" style="position:absolute;margin-left:0;margin-top:0;width:595.7pt;height:841.9pt;z-index:-251658240;mso-position-horizontal:center;mso-position-horizontal-relative:margin;mso-position-vertical:center;mso-position-vertical-relative:margin" o:allowincell="f">
           <v:imagedata r:id="rId1" o:title="9 IDIOMAS"/>
+          <w10:wrap anchorx="margin" anchory="margin"/>
         </v:shape>
       </w:pict>
     </w:r>

</xml_diff>